<commit_message>
Lab companions + guides update: federated-query walkthrough with screenshots, console-orientation starring fix, scheduled-query consent gotcha + instructor-hosted nested demo tables (build_demo_tables.sql), WorkBook field notes, Day1/Day2 slide decks
</commit_message>
<xml_diff>
--- a/day1/03_activity-console-orientation/activity-guide.docx
+++ b/day1/03_activity-console-orientation/activity-guide.docx
@@ -511,33 +511,38 @@
         </w:numPr>
       </w:pPr>
       <w:r>
-        <w:t xml:space="preserve">In the Explorer pane, click</w:t>
-      </w:r>
-      <w:r>
-        <w:t xml:space="preserve"> </w:t>
-      </w:r>
-      <w:r>
-        <w:rPr>
-          <w:b/>
-          <w:bCs/>
-        </w:rPr>
-        <w:t xml:space="preserve">+ Add</w:t>
-      </w:r>
-      <w:r>
-        <w:t xml:space="preserve">, then choose</w:t>
-      </w:r>
-      <w:r>
-        <w:t xml:space="preserve"> </w:t>
-      </w:r>
-      <w:r>
-        <w:rPr>
-          <w:b/>
-          <w:bCs/>
-        </w:rPr>
-        <w:t xml:space="preserve">Star a project by name</w:t>
-      </w:r>
-      <w:r>
-        <w:t xml:space="preserve">.</w:t>
+        <w:t xml:space="preserve">Open the project in the console — the quickest way is the direct URL:</w:t>
+      </w:r>
+      <w:r>
+        <w:t xml:space="preserve"> </w:t>
+      </w:r>
+      <w:r>
+        <w:rPr>
+          <w:rStyle w:val="VerbatimChar"/>
+        </w:rPr>
+        <w:t xml:space="preserve">https://console.cloud.google.com/bigquery?project=bigquery-samples</w:t>
+      </w:r>
+      <w:r>
+        <w:t xml:space="preserve"> </w:t>
+      </w:r>
+      <w:r>
+        <w:t xml:space="preserve">(or find it in the</w:t>
+      </w:r>
+      <w:r>
+        <w:t xml:space="preserve"> </w:t>
+      </w:r>
+      <w:r>
+        <w:rPr>
+          <w:b/>
+          <w:bCs/>
+        </w:rPr>
+        <w:t xml:space="preserve">project picker</w:t>
+      </w:r>
+      <w:r>
+        <w:t xml:space="preserve"> </w:t>
+      </w:r>
+      <w:r>
+        <w:t xml:space="preserve">at the top).</w:t>
       </w:r>
     </w:p>
     <w:p>
@@ -549,16 +554,23 @@
         </w:numPr>
       </w:pPr>
       <w:r>
-        <w:t xml:space="preserve">Type the name exactly and confirm:</w:t>
-      </w:r>
-      <w:r>
-        <w:t xml:space="preserve"> </w:t>
-      </w:r>
-      <w:r>
-        <w:rPr>
-          <w:rStyle w:val="VerbatimChar"/>
-        </w:rPr>
-        <w:t xml:space="preserve">bigquery-samples</w:t>
+        <w:t xml:space="preserve">In the Explorer pane, click the</w:t>
+      </w:r>
+      <w:r>
+        <w:t xml:space="preserve"> </w:t>
+      </w:r>
+      <w:r>
+        <w:rPr>
+          <w:b/>
+          <w:bCs/>
+        </w:rPr>
+        <w:t xml:space="preserve">star outline</w:t>
+      </w:r>
+      <w:r>
+        <w:t xml:space="preserve"> </w:t>
+      </w:r>
+      <w:r>
+        <w:t xml:space="preserve">next to the project's name so it turns solid — the project is now starred (pinned) in your Explorer.</w:t>
       </w:r>
     </w:p>
     <w:p>
@@ -634,7 +646,7 @@
         </w:r>
       </w:hyperlink>
       <w:r>
-        <w:t xml:space="preserve">)</w:t>
+        <w:t xml:space="preserve">. The console changes often — older instructions say "+ Add → Star a project by name"; today you open the project and click its star in the Explorer. The recorded walkthrough shows both this and everything below.)</w:t>
       </w:r>
     </w:p>
     <w:bookmarkEnd w:id="16"/>

</xml_diff>